<commit_message>
Sync from .app 5064c13: Ukrainian estimate page (/uk/), Norwegian copy, phone hero order, tablet tooltip fix
- tools/sync-from-app.sh mirrors uk/ like pl/ (canonical .eu, sign-up and legal on .app)
- sitemap.xml now lists /uk/koshtorys-elektromontazhni-roboty/

Co-Authored-By: Claude Opus 5.5 <noreply@anthropic.com>
</commit_message>
<xml_diff>
--- a/site/downloads/tilbudsmal-elektriker.docx
+++ b/site/downloads/tilbudsmal-elektriker.docx
@@ -161,7 +161,7 @@
                 <w:color w:val="1F2937"/>
                 <w:sz w:val="20"/>
               </w:rPr>
-              <w:t>Pris: [Fastpris / Prisoverslag]</w:t>
+              <w:t>Pristype: [fastpris / prisoverslag]</w:t>
             </w:r>
           </w:p>
         </w:tc>
@@ -178,7 +178,7 @@
           <w:color w:val="94A3B8"/>
           <w:sz w:val="16"/>
         </w:rPr>
-        <w:t>Ikke MVA-registrert? Slett MVA-linjen og «MVA» bak org.nr.</w:t>
+        <w:t>Ikke MVA-registrert? Fjern MVA-linjen og «MVA» etter organisasjonsnummeret.</w:t>
       </w:r>
     </w:p>
     <w:tbl>
@@ -281,7 +281,7 @@
                 <w:color w:val="64748B"/>
                 <w:sz w:val="16"/>
               </w:rPr>
-              <w:t>ADRESSE FOR ARBEIDET (hvis annen)</w:t>
+              <w:t>OPPDRAGSADRESSE (hvis en annen enn kundens)</w:t>
             </w:r>
           </w:p>
           <w:p>
@@ -353,7 +353,7 @@
                 <w:color w:val="94A3B8"/>
                 <w:sz w:val="20"/>
               </w:rPr>
-              <w:t>[Beskriv nøyaktig hva du skal gjøre, f.eks. bytte sikringsskap til nytt med 12 kurser, jordfeilbrytere, kontroll og igangkjøring.]</w:t>
+              <w:t>[Beskriv arbeidets omfang, materialene som inngår, og eventuelle forutsetninger. Oppgi også avtalt tidspunkt for oppstart og ferdigstillelse.]</w:t>
             </w:r>
           </w:p>
         </w:tc>
@@ -975,7 +975,7 @@
                 <w:color w:val="1F2937"/>
                 <w:sz w:val="20"/>
               </w:rPr>
-              <w:t>Sum eks. MVA</w:t>
+              <w:t>Sum ekskl. MVA</w:t>
             </w:r>
           </w:p>
         </w:tc>
@@ -1018,7 +1018,7 @@
                 <w:color w:val="1F2937"/>
                 <w:sz w:val="20"/>
               </w:rPr>
-              <w:t>MVA 25 % (kun hvis MVA-registrert)</w:t>
+              <w:t>MVA 25 % (kun for MVA-registrerte)</w:t>
             </w:r>
           </w:p>
         </w:tc>
@@ -1062,7 +1062,7 @@
                 <w:color w:val="1F2937"/>
                 <w:sz w:val="20"/>
               </w:rPr>
-              <w:t>TOTALT</w:t>
+              <w:t>TOTALT Å BETALE</w:t>
             </w:r>
           </w:p>
         </w:tc>
@@ -1115,7 +1115,7 @@
           <w:color w:val="1F2937"/>
           <w:sz w:val="19"/>
         </w:rPr>
-        <w:t>Bygningsmessige arbeider som hulltaking og utbedring av overflater (puss, maling), feil i den eksisterende installasjonen og gebyrer fra nettselskapet – hvis dette ikke er nevnt over. Tilleggsarbeid prises separat før det starter.</w:t>
+        <w:t>Med mindre annet er oppgitt, er hulltaking, overflatearbeid, utbedring av feil i eksisterende anlegg og gebyrer fra nettselskapet ikke inkludert. Tilleggsarbeid og pris avtales før arbeidet starter.</w:t>
       </w:r>
     </w:p>
     <w:p>
@@ -1143,7 +1143,7 @@
           <w:color w:val="1F2937"/>
           <w:sz w:val="19"/>
         </w:rPr>
-        <w:t>Samsvarserklæring og annen dokumentasjon som gjelder arbeidet leveres til eieren av anlegget, der det er aktuelt – senest ved ferdigstillelse, eller sammen med fakturaen for små oppdrag.</w:t>
+        <w:t>Påkrevd samsvarserklæring og tilhørende dokumentasjon leveres til anleggseieren ved ferdigstillelse.</w:t>
       </w:r>
     </w:p>
     <w:p>
@@ -1171,7 +1171,7 @@
           <w:color w:val="1F2937"/>
           <w:sz w:val="19"/>
         </w:rPr>
-        <w:t>Forskudd [__] % ved aksept. Resten betales innen [__] dager etter ferdigstillelse.</w:t>
+        <w:t>Eventuelt avtalt forskudd: [__] %. Restbeløpet forfaller [__] dager etter ferdigstillelse.</w:t>
       </w:r>
     </w:p>
     <w:p>
@@ -1213,7 +1213,7 @@
           <w:color w:val="64748B"/>
           <w:sz w:val="19"/>
         </w:rPr>
-        <w:t>Tilbudet er gyldig i 30 dager fra datoen over.</w:t>
+        <w:t>Tilbudet gjelder til datoen i feltet «Gyldig til».</w:t>
       </w:r>
     </w:p>
     <w:p>
@@ -1241,7 +1241,7 @@
           <w:color w:val="1F2937"/>
           <w:sz w:val="19"/>
         </w:rPr>
-        <w:t>Jeg aksepterer dette tilbudet og vilkårene over.</w:t>
+        <w:t>Jeg godtar tilbudet og vilkårene ovenfor. Avtalen begrenser ikke forbrukerens lovfestede rettigheter.</w:t>
       </w:r>
     </w:p>
     <w:tbl>

</xml_diff>